<commit_message>
Add forming-process comparison questions; cold drawn is preference not mandate
Clarifies that cold drawing was preferred, not required — hot extrusion
and forging are acceptable when roundness and one-piece conditions are
met. New Phase 3B (Q13-Q17) asks per-size available processes,
written-guaranteed mechanical properties per process and standard,
through-wall T6 response for the 30 mm wall, peripheral coarse-grain
control, residual stress relief, and ultrasonic inspection — with an
internal comparison matrix noting T6 heat treatment, not the forming
method, sets most of the strength and hardness.

Co-Authored-By: Claude Fable 5 <noreply@anthropic.com>
Claude-Session: https://claude.ai/code/session_01D8V4YsNDSgybhuKSqPBmt4
</commit_message>
<xml_diff>
--- a/docs/shandong-botong/Botong_Manufacturer_Verification_Questions.docx
+++ b/docs/shandong-botong/Botong_Manufacturer_Verification_Questions.docx
@@ -70,7 +70,29 @@
           <w:sz w:val="20"/>
           <w:szCs w:val="20"/>
         </w:rPr>
-        <w:t xml:space="preserve">목적: Botong이 당사 요구 품목(6061-T6 냉간인발 무계목관)의 직접 제조사인지 확정. 아니라면 최종 고객 현장실사 때 생산 현장을 보여줄 체제를 서면 확보. 요령: 우리가 파악한 사실(경영범위·ISO·프레스 분석)은 Phase 3 전까지 꺼내지 않는다 — 열린 질문부터 시작해 답이 스스로 좁혀지게 한다.</w:t>
+        <w:t xml:space="preserve">목적: ① Botong이 당사 요구 품목(6061-T6 무계목관)의 직접 제조사인지 확정 — 아니라면 최종 고객 현장실사 때 생산 현장을 보여줄 체제를 서면 확보. ② 성형 공정(냉간인발/열간압출/단조)별 물성 차이와 우리에게 유리한 방식에 대한 답을 데이터로 받아온다. 요령: 우리가 파악한 사실(경영범위·ISO·프레스 분석)은 Phase 3 전까지 꺼내지 않는다.</w:t>
+      </w:r>
+    </w:p>
+    <w:p>
+      <w:pPr>
+        <w:pBdr>
+          <w:top w:val="single" w:color="B03030" w:sz="4"/>
+          <w:bottom w:val="single" w:color="B03030" w:sz="4"/>
+          <w:left w:val="single" w:color="B03030" w:sz="24"/>
+        </w:pBdr>
+        <w:shd w:fill="FDECEA" w:val="clear"/>
+        <w:spacing w:after="140" w:before="80"/>
+        <w:ind w:left="200" w:right="200"/>
+      </w:pPr>
+      <w:r>
+        <w:rPr>
+          <w:b/>
+          <w:bCs/>
+          <w:color w:val="3A2020"/>
+          <w:sz w:val="20"/>
+          <w:szCs w:val="20"/>
+        </w:rPr>
+        <w:t xml:space="preserve">전제: 냉간인발은 선호일 뿐 필수가 아님. 진원도(360° 편차 0.5mm)·단일피스 조건 충족 시 열간압출·단조 수용 가능 — 공정 자체보다 "어떤 공정으로 어떤 물성을 보증하는가"를 받아내는 것이 목표.</w:t>
       </w:r>
     </w:p>
     <w:p>
@@ -294,7 +316,7 @@
           <w:sz w:val="21"/>
           <w:szCs w:val="21"/>
         </w:rPr>
-        <w:t xml:space="preserve">For our order — 6061-T6 cold drawn seamless tubes, 450×30×3000 and 460×8×3000 — will these be produced in this factory? If yes, on which production line?</w:t>
+        <w:t xml:space="preserve">For our order — 6061-T6 seamless tubes, 450×30×3000 and 460×8×3000 — will these be produced in this factory? If yes, on which production line and by which process?</w:t>
       </w:r>
     </w:p>
     <w:p>
@@ -543,7 +565,843 @@
           <w:sz w:val="19"/>
           <w:szCs w:val="19"/>
         </w:rPr>
-        <w:t xml:space="preserve">※ 표준 선택이 곧 공정 자백. MTC 재발행에도 이 표준이 명기되어야 함.</w:t>
+        <w:t xml:space="preserve">※ 표준 선택이 곧 공정 자백. MTC 재발행에도 명기 필요. (냉간인발은 필수가 아니라 선호 — 공정 확인이 목적)</w:t>
+      </w:r>
+    </w:p>
+    <w:p>
+      <w:pPr>
+        <w:pStyle w:val="Heading1"/>
+        <w:pBdr>
+          <w:bottom w:val="single" w:color="5A9A96" w:sz="4"/>
+        </w:pBdr>
+        <w:spacing w:after="120" w:before="300"/>
+      </w:pPr>
+      <w:r>
+        <w:rPr>
+          <w:b/>
+          <w:bCs/>
+          <w:color w:val="2E5878"/>
+          <w:sz w:val="25"/>
+          <w:szCs w:val="25"/>
+        </w:rPr>
+        <w:t xml:space="preserve">Phase 3B — 공정 선택 질의: 어느 성형법이 우리에게 유리한가 (★ 반드시 답 받아올 것)</w:t>
+      </w:r>
+    </w:p>
+    <w:p>
+      <w:pPr>
+        <w:spacing w:after="40" w:before="140"/>
+      </w:pPr>
+      <w:r>
+        <w:rPr>
+          <w:b/>
+          <w:bCs/>
+          <w:color w:val="2E5878"/>
+          <w:sz w:val="22"/>
+          <w:szCs w:val="22"/>
+        </w:rPr>
+        <w:t xml:space="preserve">Q13.  </w:t>
+      </w:r>
+      <w:r>
+        <w:rPr>
+          <w:b/>
+          <w:bCs/>
+          <w:sz w:val="21"/>
+          <w:szCs w:val="21"/>
+        </w:rPr>
+        <w:t xml:space="preserve">To be clear about our requirement: cold drawn is our preference, not a mandate. Hot extrusion or forging is acceptable IF the roundness (0.5 mm over 360°) and one-piece seamless conditions are met. So — for each of our sizes, which forming methods can you actually offer? Please mark per size: cold drawn / hot extruded / forged.</w:t>
+      </w:r>
+    </w:p>
+    <w:p>
+      <w:pPr>
+        <w:spacing w:after="30"/>
+        <w:ind w:left="500"/>
+      </w:pPr>
+      <w:r>
+        <w:rPr>
+          <w:color w:val="6A7A88"/>
+          <w:sz w:val="20"/>
+          <w:szCs w:val="20"/>
+        </w:rPr>
+        <w:t xml:space="preserve">(한) 냉간인발은 선호일 뿐 필수 아님을 먼저 밝히고, 규격별 제공 가능 성형법을 표로 받는다.</w:t>
+      </w:r>
+    </w:p>
+    <w:p>
+      <w:pPr>
+        <w:spacing w:after="40" w:before="140"/>
+      </w:pPr>
+      <w:r>
+        <w:rPr>
+          <w:b/>
+          <w:bCs/>
+          <w:color w:val="B03030"/>
+          <w:sz w:val="22"/>
+          <w:szCs w:val="22"/>
+        </w:rPr>
+        <w:t xml:space="preserve">Q14.  </w:t>
+      </w:r>
+      <w:r>
+        <w:rPr>
+          <w:b/>
+          <w:bCs/>
+          <w:sz w:val="21"/>
+          <w:szCs w:val="21"/>
+        </w:rPr>
+        <w:t xml:space="preserve">For each method you can offer, what mechanical properties can you guarantee in writing for 6061-T6 — tensile strength, yield strength, elongation, and hardness (HBW) — and to which product standard (GB/T 6893 / GB/T 4437.1 / ASTM B210 / B221 / forging standard)?</w:t>
+      </w:r>
+    </w:p>
+    <w:p>
+      <w:pPr>
+        <w:spacing w:after="30"/>
+        <w:ind w:left="500"/>
+      </w:pPr>
+      <w:r>
+        <w:rPr>
+          <w:color w:val="6A7A88"/>
+          <w:sz w:val="20"/>
+          <w:szCs w:val="20"/>
+        </w:rPr>
+        <w:t xml:space="preserve">(한) 공정별 서면 보증 물성치(인장·항복·연신율·경도)와 근거 표준 요구.</w:t>
+      </w:r>
+    </w:p>
+    <w:p>
+      <w:pPr>
+        <w:spacing w:after="60"/>
+        <w:ind w:left="500"/>
+      </w:pPr>
+      <w:r>
+        <w:rPr>
+          <w:i/>
+          <w:iCs/>
+          <w:color w:val="5A9A96"/>
+          <w:sz w:val="19"/>
+          <w:szCs w:val="19"/>
+        </w:rPr>
+        <w:t xml:space="preserve">※ 경도·강도가 공정에 따라 달라지는지에 대한 공식 답변 — 말이 아니라 보증 수치로 받는다.</w:t>
+      </w:r>
+    </w:p>
+    <w:p>
+      <w:pPr>
+        <w:spacing w:after="40" w:before="140"/>
+      </w:pPr>
+      <w:r>
+        <w:rPr>
+          <w:b/>
+          <w:bCs/>
+          <w:color w:val="2E5878"/>
+          <w:sz w:val="22"/>
+          <w:szCs w:val="22"/>
+        </w:rPr>
+        <w:t xml:space="preserve">Q15.  </w:t>
+      </w:r>
+      <w:r>
+        <w:rPr>
+          <w:b/>
+          <w:bCs/>
+          <w:sz w:val="21"/>
+          <w:szCs w:val="21"/>
+        </w:rPr>
+        <w:t xml:space="preserve">For the 30 mm thick wall (450×30): can your T6 heat treatment achieve full properties through the wall thickness? Please show mid-wall hardness data. And for large extruded sections — how do you control the peripheral coarse-grain ring and property uniformity around the circumference?</w:t>
+      </w:r>
+    </w:p>
+    <w:p>
+      <w:pPr>
+        <w:spacing w:after="30"/>
+        <w:ind w:left="500"/>
+      </w:pPr>
+      <w:r>
+        <w:rPr>
+          <w:color w:val="6A7A88"/>
+          <w:sz w:val="20"/>
+          <w:szCs w:val="20"/>
+        </w:rPr>
+        <w:t xml:space="preserve">(한) 30mm 후벽의 T6 관통 열처리(심부 경도) 데이터, 압출품 표피 조대결정륜·원주방향 균일성 관리.</w:t>
+      </w:r>
+    </w:p>
+    <w:p>
+      <w:pPr>
+        <w:spacing w:after="60"/>
+        <w:ind w:left="500"/>
+      </w:pPr>
+      <w:r>
+        <w:rPr>
+          <w:i/>
+          <w:iCs/>
+          <w:color w:val="5A9A96"/>
+          <w:sz w:val="19"/>
+          <w:szCs w:val="19"/>
+        </w:rPr>
+        <w:t xml:space="preserve">※ 쿨링롤은 원주방향 경도 불균일이 마모·열전달 불균일로 직결.</w:t>
+      </w:r>
+    </w:p>
+    <w:p>
+      <w:pPr>
+        <w:spacing w:after="40" w:before="140"/>
+      </w:pPr>
+      <w:r>
+        <w:rPr>
+          <w:b/>
+          <w:bCs/>
+          <w:color w:val="2E5878"/>
+          <w:sz w:val="22"/>
+          <w:szCs w:val="22"/>
+        </w:rPr>
+        <w:t xml:space="preserve">Q16.  </w:t>
+      </w:r>
+      <w:r>
+        <w:rPr>
+          <w:b/>
+          <w:bCs/>
+          <w:sz w:val="21"/>
+          <w:szCs w:val="21"/>
+        </w:rPr>
+        <w:t xml:space="preserve">Our rolls are finish-machined and rotate continuously — residual stress in the raw tube causes distortion during machining, which is a rejection risk for us. Do you perform stress relief after forming (stretching or thermal)? Can the residual stress control method be stated in the MTC?</w:t>
+      </w:r>
+    </w:p>
+    <w:p>
+      <w:pPr>
+        <w:spacing w:after="30"/>
+        <w:ind w:left="500"/>
+      </w:pPr>
+      <w:r>
+        <w:rPr>
+          <w:color w:val="6A7A88"/>
+          <w:sz w:val="20"/>
+          <w:szCs w:val="20"/>
+        </w:rPr>
+        <w:t xml:space="preserve">(한) 성형 후 잔류응력 제거(인장교정/열처리) 여부와 MTC 명기 가능 여부.</w:t>
+      </w:r>
+    </w:p>
+    <w:p>
+      <w:pPr>
+        <w:spacing w:after="60"/>
+        <w:ind w:left="500"/>
+      </w:pPr>
+      <w:r>
+        <w:rPr>
+          <w:i/>
+          <w:iCs/>
+          <w:color w:val="5A9A96"/>
+          <w:sz w:val="19"/>
+          <w:szCs w:val="19"/>
+        </w:rPr>
+        <w:t xml:space="preserve">※ 재가공 전제인 우리에게는 강도보다 실질적으로 더 중요할 수 있음.</w:t>
+      </w:r>
+    </w:p>
+    <w:p>
+      <w:pPr>
+        <w:spacing w:after="40" w:before="140"/>
+      </w:pPr>
+      <w:r>
+        <w:rPr>
+          <w:b/>
+          <w:bCs/>
+          <w:color w:val="2E5878"/>
+          <w:sz w:val="22"/>
+          <w:szCs w:val="22"/>
+        </w:rPr>
+        <w:t xml:space="preserve">Q17.  </w:t>
+      </w:r>
+      <w:r>
+        <w:rPr>
+          <w:b/>
+          <w:bCs/>
+          <w:sz w:val="21"/>
+          <w:szCs w:val="21"/>
+        </w:rPr>
+        <w:t xml:space="preserve">For thick-wall or forged product, can you perform ultrasonic inspection for internal defects and attach the report to each lot?</w:t>
+      </w:r>
+    </w:p>
+    <w:p>
+      <w:pPr>
+        <w:spacing w:after="30"/>
+        <w:ind w:left="500"/>
+      </w:pPr>
+      <w:r>
+        <w:rPr>
+          <w:color w:val="6A7A88"/>
+          <w:sz w:val="20"/>
+          <w:szCs w:val="20"/>
+        </w:rPr>
+        <w:t xml:space="preserve">(한) 후벽·단조품 내부 결함 UT 검사 및 로트별 성적서 첨부 가능 여부.</w:t>
+      </w:r>
+    </w:p>
+    <w:tbl>
+      <w:tblPr>
+        <w:tblW w:type="dxa" w:w="9306"/>
+        <w:tblBorders>
+          <w:top w:val="single" w:color="auto" w:sz="4"/>
+          <w:left w:val="single" w:color="auto" w:sz="4"/>
+          <w:bottom w:val="single" w:color="auto" w:sz="4"/>
+          <w:right w:val="single" w:color="auto" w:sz="4"/>
+          <w:insideH w:val="single" w:color="auto" w:sz="4"/>
+          <w:insideV w:val="single" w:color="auto" w:sz="4"/>
+        </w:tblBorders>
+      </w:tblPr>
+      <w:tblGrid>
+        <w:gridCol w:w="2100"/>
+        <w:gridCol w:w="1900"/>
+        <w:gridCol w:w="2300"/>
+        <w:gridCol w:w="3006"/>
+      </w:tblGrid>
+      <w:tr>
+        <w:tc>
+          <w:tcPr>
+            <w:tcW w:type="dxa" w:w="2100"/>
+            <w:shd w:fill="E4EEF1" w:val="clear"/>
+            <w:tcMar>
+              <w:top w:type="dxa" w:w="55"/>
+              <w:left w:type="dxa" w:w="100"/>
+              <w:bottom w:type="dxa" w:w="55"/>
+              <w:right w:type="dxa" w:w="100"/>
+            </w:tcMar>
+            <w:vAlign w:val="center"/>
+          </w:tcPr>
+          <w:p>
+            <w:pPr>
+              <w:spacing w:after="0"/>
+            </w:pPr>
+            <w:r>
+              <w:rPr>
+                <w:b/>
+                <w:bCs/>
+                <w:color w:val="2E5878"/>
+                <w:sz w:val="19"/>
+                <w:szCs w:val="19"/>
+              </w:rPr>
+              <w:t xml:space="preserve">기준</w:t>
+            </w:r>
+          </w:p>
+        </w:tc>
+        <w:tc>
+          <w:tcPr>
+            <w:tcW w:type="dxa" w:w="1900"/>
+            <w:shd w:fill="E4EEF1" w:val="clear"/>
+            <w:tcMar>
+              <w:top w:type="dxa" w:w="55"/>
+              <w:left w:type="dxa" w:w="100"/>
+              <w:bottom w:type="dxa" w:w="55"/>
+              <w:right w:type="dxa" w:w="100"/>
+            </w:tcMar>
+            <w:vAlign w:val="center"/>
+          </w:tcPr>
+          <w:p>
+            <w:pPr>
+              <w:spacing w:after="0"/>
+            </w:pPr>
+            <w:r>
+              <w:rPr>
+                <w:b/>
+                <w:bCs/>
+                <w:color w:val="2E5878"/>
+                <w:sz w:val="19"/>
+                <w:szCs w:val="19"/>
+              </w:rPr>
+              <w:t xml:space="preserve">냉간인발</w:t>
+            </w:r>
+          </w:p>
+        </w:tc>
+        <w:tc>
+          <w:tcPr>
+            <w:tcW w:type="dxa" w:w="2300"/>
+            <w:shd w:fill="E4EEF1" w:val="clear"/>
+            <w:tcMar>
+              <w:top w:type="dxa" w:w="55"/>
+              <w:left w:type="dxa" w:w="100"/>
+              <w:bottom w:type="dxa" w:w="55"/>
+              <w:right w:type="dxa" w:w="100"/>
+            </w:tcMar>
+            <w:vAlign w:val="center"/>
+          </w:tcPr>
+          <w:p>
+            <w:pPr>
+              <w:spacing w:after="0"/>
+            </w:pPr>
+            <w:r>
+              <w:rPr>
+                <w:b/>
+                <w:bCs/>
+                <w:color w:val="2E5878"/>
+                <w:sz w:val="19"/>
+                <w:szCs w:val="19"/>
+              </w:rPr>
+              <w:t xml:space="preserve">열간압출</w:t>
+            </w:r>
+          </w:p>
+        </w:tc>
+        <w:tc>
+          <w:tcPr>
+            <w:tcW w:type="dxa" w:w="3006"/>
+            <w:shd w:fill="E4EEF1" w:val="clear"/>
+            <w:tcMar>
+              <w:top w:type="dxa" w:w="55"/>
+              <w:left w:type="dxa" w:w="100"/>
+              <w:bottom w:type="dxa" w:w="55"/>
+              <w:right w:type="dxa" w:w="100"/>
+            </w:tcMar>
+            <w:vAlign w:val="center"/>
+          </w:tcPr>
+          <w:p>
+            <w:pPr>
+              <w:spacing w:after="0"/>
+            </w:pPr>
+            <w:r>
+              <w:rPr>
+                <w:b/>
+                <w:bCs/>
+                <w:color w:val="2E5878"/>
+                <w:sz w:val="19"/>
+                <w:szCs w:val="19"/>
+              </w:rPr>
+              <w:t xml:space="preserve">단조</w:t>
+            </w:r>
+          </w:p>
+        </w:tc>
+      </w:tr>
+      <w:tr>
+        <w:tc>
+          <w:tcPr>
+            <w:tcW w:type="dxa" w:w="2100"/>
+            <w:tcMar>
+              <w:top w:type="dxa" w:w="55"/>
+              <w:left w:type="dxa" w:w="100"/>
+              <w:bottom w:type="dxa" w:w="55"/>
+              <w:right w:type="dxa" w:w="100"/>
+            </w:tcMar>
+            <w:vAlign w:val="center"/>
+          </w:tcPr>
+          <w:p>
+            <w:pPr>
+              <w:spacing w:after="0"/>
+            </w:pPr>
+            <w:r>
+              <w:rPr>
+                <w:b w:val="false"/>
+                <w:bCs w:val="false"/>
+                <w:sz w:val="19"/>
+                <w:szCs w:val="19"/>
+              </w:rPr>
+              <w:t xml:space="preserve">표준 보증 강도</w:t>
+            </w:r>
+          </w:p>
+        </w:tc>
+        <w:tc>
+          <w:tcPr>
+            <w:tcW w:type="dxa" w:w="1900"/>
+            <w:tcMar>
+              <w:top w:type="dxa" w:w="55"/>
+              <w:left w:type="dxa" w:w="100"/>
+              <w:bottom w:type="dxa" w:w="55"/>
+              <w:right w:type="dxa" w:w="100"/>
+            </w:tcMar>
+            <w:vAlign w:val="center"/>
+          </w:tcPr>
+          <w:p>
+            <w:pPr>
+              <w:spacing w:after="0"/>
+            </w:pPr>
+            <w:r>
+              <w:rPr>
+                <w:b w:val="false"/>
+                <w:bCs w:val="false"/>
+                <w:sz w:val="19"/>
+                <w:szCs w:val="19"/>
+              </w:rPr>
+              <w:t xml:space="preserve">다소 높음 (GB/T 6893: 310/275)</w:t>
+            </w:r>
+          </w:p>
+        </w:tc>
+        <w:tc>
+          <w:tcPr>
+            <w:tcW w:type="dxa" w:w="2300"/>
+            <w:tcMar>
+              <w:top w:type="dxa" w:w="55"/>
+              <w:left w:type="dxa" w:w="100"/>
+              <w:bottom w:type="dxa" w:w="55"/>
+              <w:right w:type="dxa" w:w="100"/>
+            </w:tcMar>
+            <w:vAlign w:val="center"/>
+          </w:tcPr>
+          <w:p>
+            <w:pPr>
+              <w:spacing w:after="0"/>
+            </w:pPr>
+            <w:r>
+              <w:rPr>
+                <w:b w:val="false"/>
+                <w:bCs w:val="false"/>
+                <w:sz w:val="19"/>
+                <w:szCs w:val="19"/>
+              </w:rPr>
+              <w:t xml:space="preserve">최소치 낮은 편 (B221급 ~290/240)</w:t>
+            </w:r>
+          </w:p>
+        </w:tc>
+        <w:tc>
+          <w:tcPr>
+            <w:tcW w:type="dxa" w:w="3006"/>
+            <w:tcMar>
+              <w:top w:type="dxa" w:w="55"/>
+              <w:left w:type="dxa" w:w="100"/>
+              <w:bottom w:type="dxa" w:w="55"/>
+              <w:right w:type="dxa" w:w="100"/>
+            </w:tcMar>
+            <w:vAlign w:val="center"/>
+          </w:tcPr>
+          <w:p>
+            <w:pPr>
+              <w:spacing w:after="0"/>
+            </w:pPr>
+            <w:r>
+              <w:rPr>
+                <w:b w:val="false"/>
+                <w:bCs w:val="false"/>
+                <w:sz w:val="19"/>
+                <w:szCs w:val="19"/>
+              </w:rPr>
+              <w:t xml:space="preserve">표준·업체 보증에 따름</w:t>
+            </w:r>
+          </w:p>
+        </w:tc>
+      </w:tr>
+      <w:tr>
+        <w:tc>
+          <w:tcPr>
+            <w:tcW w:type="dxa" w:w="2100"/>
+            <w:tcMar>
+              <w:top w:type="dxa" w:w="55"/>
+              <w:left w:type="dxa" w:w="100"/>
+              <w:bottom w:type="dxa" w:w="55"/>
+              <w:right w:type="dxa" w:w="100"/>
+            </w:tcMar>
+            <w:vAlign w:val="center"/>
+          </w:tcPr>
+          <w:p>
+            <w:pPr>
+              <w:spacing w:after="0"/>
+            </w:pPr>
+            <w:r>
+              <w:rPr>
+                <w:b w:val="false"/>
+                <w:bCs w:val="false"/>
+                <w:sz w:val="19"/>
+                <w:szCs w:val="19"/>
+              </w:rPr>
+              <w:t xml:space="preserve">조직</w:t>
+            </w:r>
+          </w:p>
+        </w:tc>
+        <w:tc>
+          <w:tcPr>
+            <w:tcW w:type="dxa" w:w="1900"/>
+            <w:tcMar>
+              <w:top w:type="dxa" w:w="55"/>
+              <w:left w:type="dxa" w:w="100"/>
+              <w:bottom w:type="dxa" w:w="55"/>
+              <w:right w:type="dxa" w:w="100"/>
+            </w:tcMar>
+            <w:vAlign w:val="center"/>
+          </w:tcPr>
+          <w:p>
+            <w:pPr>
+              <w:spacing w:after="0"/>
+            </w:pPr>
+            <w:r>
+              <w:rPr>
+                <w:b w:val="false"/>
+                <w:bCs w:val="false"/>
+                <w:sz w:val="19"/>
+                <w:szCs w:val="19"/>
+              </w:rPr>
+              <w:t xml:space="preserve">미세·균일</w:t>
+            </w:r>
+          </w:p>
+        </w:tc>
+        <w:tc>
+          <w:tcPr>
+            <w:tcW w:type="dxa" w:w="2300"/>
+            <w:tcMar>
+              <w:top w:type="dxa" w:w="55"/>
+              <w:left w:type="dxa" w:w="100"/>
+              <w:bottom w:type="dxa" w:w="55"/>
+              <w:right w:type="dxa" w:w="100"/>
+            </w:tcMar>
+            <w:vAlign w:val="center"/>
+          </w:tcPr>
+          <w:p>
+            <w:pPr>
+              <w:spacing w:after="0"/>
+            </w:pPr>
+            <w:r>
+              <w:rPr>
+                <w:b w:val="false"/>
+                <w:bCs w:val="false"/>
+                <w:sz w:val="19"/>
+                <w:szCs w:val="19"/>
+              </w:rPr>
+              <w:t xml:space="preserve">대단면 표피 조대결정륜 주의</w:t>
+            </w:r>
+          </w:p>
+        </w:tc>
+        <w:tc>
+          <w:tcPr>
+            <w:tcW w:type="dxa" w:w="3006"/>
+            <w:tcMar>
+              <w:top w:type="dxa" w:w="55"/>
+              <w:left w:type="dxa" w:w="100"/>
+              <w:bottom w:type="dxa" w:w="55"/>
+              <w:right w:type="dxa" w:w="100"/>
+            </w:tcMar>
+            <w:vAlign w:val="center"/>
+          </w:tcPr>
+          <w:p>
+            <w:pPr>
+              <w:spacing w:after="0"/>
+            </w:pPr>
+            <w:r>
+              <w:rPr>
+                <w:b w:val="false"/>
+                <w:bCs w:val="false"/>
+                <w:sz w:val="19"/>
+                <w:szCs w:val="19"/>
+              </w:rPr>
+              <w:t xml:space="preserve">치밀, 내부 건전성 최고</w:t>
+            </w:r>
+          </w:p>
+        </w:tc>
+      </w:tr>
+      <w:tr>
+        <w:tc>
+          <w:tcPr>
+            <w:tcW w:type="dxa" w:w="2100"/>
+            <w:tcMar>
+              <w:top w:type="dxa" w:w="55"/>
+              <w:left w:type="dxa" w:w="100"/>
+              <w:bottom w:type="dxa" w:w="55"/>
+              <w:right w:type="dxa" w:w="100"/>
+            </w:tcMar>
+            <w:vAlign w:val="center"/>
+          </w:tcPr>
+          <w:p>
+            <w:pPr>
+              <w:spacing w:after="0"/>
+            </w:pPr>
+            <w:r>
+              <w:rPr>
+                <w:b w:val="false"/>
+                <w:bCs w:val="false"/>
+                <w:sz w:val="19"/>
+                <w:szCs w:val="19"/>
+              </w:rPr>
+              <w:t xml:space="preserve">잔류응력</w:t>
+            </w:r>
+          </w:p>
+        </w:tc>
+        <w:tc>
+          <w:tcPr>
+            <w:tcW w:type="dxa" w:w="1900"/>
+            <w:tcMar>
+              <w:top w:type="dxa" w:w="55"/>
+              <w:left w:type="dxa" w:w="100"/>
+              <w:bottom w:type="dxa" w:w="55"/>
+              <w:right w:type="dxa" w:w="100"/>
+            </w:tcMar>
+            <w:vAlign w:val="center"/>
+          </w:tcPr>
+          <w:p>
+            <w:pPr>
+              <w:spacing w:after="0"/>
+            </w:pPr>
+            <w:r>
+              <w:rPr>
+                <w:b w:val="false"/>
+                <w:bCs w:val="false"/>
+                <w:sz w:val="19"/>
+                <w:szCs w:val="19"/>
+              </w:rPr>
+              <w:t xml:space="preserve">있음 (교정 필요)</w:t>
+            </w:r>
+          </w:p>
+        </w:tc>
+        <w:tc>
+          <w:tcPr>
+            <w:tcW w:type="dxa" w:w="2300"/>
+            <w:tcMar>
+              <w:top w:type="dxa" w:w="55"/>
+              <w:left w:type="dxa" w:w="100"/>
+              <w:bottom w:type="dxa" w:w="55"/>
+              <w:right w:type="dxa" w:w="100"/>
+            </w:tcMar>
+            <w:vAlign w:val="center"/>
+          </w:tcPr>
+          <w:p>
+            <w:pPr>
+              <w:spacing w:after="0"/>
+            </w:pPr>
+            <w:r>
+              <w:rPr>
+                <w:b w:val="false"/>
+                <w:bCs w:val="false"/>
+                <w:sz w:val="19"/>
+                <w:szCs w:val="19"/>
+              </w:rPr>
+              <w:t xml:space="preserve">비교적 낮음</w:t>
+            </w:r>
+          </w:p>
+        </w:tc>
+        <w:tc>
+          <w:tcPr>
+            <w:tcW w:type="dxa" w:w="3006"/>
+            <w:tcMar>
+              <w:top w:type="dxa" w:w="55"/>
+              <w:left w:type="dxa" w:w="100"/>
+              <w:bottom w:type="dxa" w:w="55"/>
+              <w:right w:type="dxa" w:w="100"/>
+            </w:tcMar>
+            <w:vAlign w:val="center"/>
+          </w:tcPr>
+          <w:p>
+            <w:pPr>
+              <w:spacing w:after="0"/>
+            </w:pPr>
+            <w:r>
+              <w:rPr>
+                <w:b w:val="false"/>
+                <w:bCs w:val="false"/>
+                <w:sz w:val="19"/>
+                <w:szCs w:val="19"/>
+              </w:rPr>
+              <w:t xml:space="preserve">열처리·가공 이력에 따름</w:t>
+            </w:r>
+          </w:p>
+        </w:tc>
+      </w:tr>
+      <w:tr>
+        <w:tc>
+          <w:tcPr>
+            <w:tcW w:type="dxa" w:w="2100"/>
+            <w:tcMar>
+              <w:top w:type="dxa" w:w="55"/>
+              <w:left w:type="dxa" w:w="100"/>
+              <w:bottom w:type="dxa" w:w="55"/>
+              <w:right w:type="dxa" w:w="100"/>
+            </w:tcMar>
+            <w:vAlign w:val="center"/>
+          </w:tcPr>
+          <w:p>
+            <w:pPr>
+              <w:spacing w:after="0"/>
+            </w:pPr>
+            <w:r>
+              <w:rPr>
+                <w:b w:val="false"/>
+                <w:bCs w:val="false"/>
+                <w:sz w:val="19"/>
+                <w:szCs w:val="19"/>
+              </w:rPr>
+              <w:t xml:space="preserve">φ450·460 현실성</w:t>
+            </w:r>
+          </w:p>
+        </w:tc>
+        <w:tc>
+          <w:tcPr>
+            <w:tcW w:type="dxa" w:w="1900"/>
+            <w:tcMar>
+              <w:top w:type="dxa" w:w="55"/>
+              <w:left w:type="dxa" w:w="100"/>
+              <w:bottom w:type="dxa" w:w="55"/>
+              <w:right w:type="dxa" w:w="100"/>
+            </w:tcMar>
+            <w:vAlign w:val="center"/>
+          </w:tcPr>
+          <w:p>
+            <w:pPr>
+              <w:spacing w:after="0"/>
+            </w:pPr>
+            <w:r>
+              <w:rPr>
+                <w:b w:val="false"/>
+                <w:bCs w:val="false"/>
+                <w:sz w:val="19"/>
+                <w:szCs w:val="19"/>
+              </w:rPr>
+              <w:t xml:space="preserve">설비 극히 드묾</w:t>
+            </w:r>
+          </w:p>
+        </w:tc>
+        <w:tc>
+          <w:tcPr>
+            <w:tcW w:type="dxa" w:w="2300"/>
+            <w:tcMar>
+              <w:top w:type="dxa" w:w="55"/>
+              <w:left w:type="dxa" w:w="100"/>
+              <w:bottom w:type="dxa" w:w="55"/>
+              <w:right w:type="dxa" w:w="100"/>
+            </w:tcMar>
+            <w:vAlign w:val="center"/>
+          </w:tcPr>
+          <w:p>
+            <w:pPr>
+              <w:spacing w:after="0"/>
+            </w:pPr>
+            <w:r>
+              <w:rPr>
+                <w:b w:val="false"/>
+                <w:bCs w:val="false"/>
+                <w:sz w:val="19"/>
+                <w:szCs w:val="19"/>
+              </w:rPr>
+              <w:t xml:space="preserve">초대형 프레스 필요</w:t>
+            </w:r>
+          </w:p>
+        </w:tc>
+        <w:tc>
+          <w:tcPr>
+            <w:tcW w:type="dxa" w:w="3006"/>
+            <w:tcMar>
+              <w:top w:type="dxa" w:w="55"/>
+              <w:left w:type="dxa" w:w="100"/>
+              <w:bottom w:type="dxa" w:w="55"/>
+              <w:right w:type="dxa" w:w="100"/>
+            </w:tcMar>
+            <w:vAlign w:val="center"/>
+          </w:tcPr>
+          <w:p>
+            <w:pPr>
+              <w:spacing w:after="0"/>
+            </w:pPr>
+            <w:r>
+              <w:rPr>
+                <w:b w:val="false"/>
+                <w:bCs w:val="false"/>
+                <w:sz w:val="19"/>
+                <w:szCs w:val="19"/>
+              </w:rPr>
+              <w:t xml:space="preserve">후벽(450×30)은 단조+가공 현실적</w:t>
+            </w:r>
+          </w:p>
+        </w:tc>
+      </w:tr>
+    </w:tbl>
+    <w:p>
+      <w:pPr>
+        <w:pBdr>
+          <w:top w:val="single" w:color="B03030" w:sz="4"/>
+          <w:bottom w:val="single" w:color="B03030" w:sz="4"/>
+          <w:left w:val="single" w:color="B03030" w:sz="24"/>
+        </w:pBdr>
+        <w:shd w:fill="FDECEA" w:val="clear"/>
+        <w:spacing w:after="140" w:before="80"/>
+        <w:ind w:left="200" w:right="200"/>
+      </w:pPr>
+      <w:r>
+        <w:rPr>
+          <w:b/>
+          <w:bCs/>
+          <w:color w:val="3A2020"/>
+          <w:sz w:val="20"/>
+          <w:szCs w:val="20"/>
+        </w:rPr>
+        <w:t xml:space="preserve">내부 참고: 6061-T6의 강도·경도는 성형법보다 T6 열처리로 대부분 결정 — 공정 불문, Q14~Q17의 보증치·관리 데이터로 결정한다.</w:t>
       </w:r>
     </w:p>
     <w:p>

</xml_diff>